<commit_message>
estoy haciendo los actualizacion de cronograma de fecha de los sprints
</commit_message>
<xml_diff>
--- a/docs/sprint 0/Sprint 0.docx
+++ b/docs/sprint 0/Sprint 0.docx
@@ -1,6 +1,6 @@
 
 <file path=word/document.xml><?xml version="1.0" encoding="utf-8"?>
-<w:document xmlns:wpc="http://schemas.microsoft.com/office/word/2010/wordprocessingCanvas" xmlns:cx="http://schemas.microsoft.com/office/drawing/2014/chartex" xmlns:cx1="http://schemas.microsoft.com/office/drawing/2015/9/8/chartex" xmlns:cx2="http://schemas.microsoft.com/office/drawing/2015/10/21/chartex" xmlns:cx3="http://schemas.microsoft.com/office/drawing/2016/5/9/chartex" xmlns:cx4="http://schemas.microsoft.com/office/drawing/2016/5/10/chartex" xmlns:cx5="http://schemas.microsoft.com/office/drawing/2016/5/11/chartex" xmlns:cx6="http://schemas.microsoft.com/office/drawing/2016/5/12/chartex" xmlns:cx7="http://schemas.microsoft.com/office/drawing/2016/5/13/chartex" xmlns:cx8="http://schemas.microsoft.com/office/drawing/2016/5/14/chartex" xmlns:mc="http://schemas.openxmlformats.org/markup-compatibility/2006" xmlns:aink="http://schemas.microsoft.com/office/drawing/2016/ink" xmlns:am3d="http://schemas.microsoft.com/office/drawing/2017/model3d" xmlns:o="urn:schemas-microsoft-com:office:office" xmlns:r="http://schemas.openxmlformats.org/officeDocument/2006/relationships" xmlns:m="http://schemas.openxmlformats.org/officeDocument/2006/math" xmlns:v="urn:schemas-microsoft-com:vml" xmlns:wp14="http://schemas.microsoft.com/office/word/2010/wordprocessingDrawing" xmlns:wp="http://schemas.openxmlformats.org/drawingml/2006/wordprocessingDrawing" xmlns:w10="urn:schemas-microsoft-com:office:word" xmlns:w="http://schemas.openxmlformats.org/wordprocessingml/2006/main" xmlns:w14="http://schemas.microsoft.com/office/word/2010/wordml" xmlns:w15="http://schemas.microsoft.com/office/word/2012/wordml" xmlns:w16cex="http://schemas.microsoft.com/office/word/2018/wordml/cex" xmlns:w16cid="http://schemas.microsoft.com/office/word/2016/wordml/cid" xmlns:w16="http://schemas.microsoft.com/office/word/2018/wordml" xmlns:w16sdtdh="http://schemas.microsoft.com/office/word/2020/wordml/sdtdatahash" xmlns:w16se="http://schemas.microsoft.com/office/word/2015/wordml/symex" xmlns:wpg="http://schemas.microsoft.com/office/word/2010/wordprocessingGroup" xmlns:wpi="http://schemas.microsoft.com/office/word/2010/wordprocessingInk" xmlns:wne="http://schemas.microsoft.com/office/word/2006/wordml" xmlns:wps="http://schemas.microsoft.com/office/word/2010/wordprocessingShape" mc:Ignorable="w14 w15 w16se w16cid w16 w16cex w16sdtdh wp14">
+<w:document xmlns:wpc="http://schemas.microsoft.com/office/word/2010/wordprocessingCanvas" xmlns:cx="http://schemas.microsoft.com/office/drawing/2014/chartex" xmlns:cx1="http://schemas.microsoft.com/office/drawing/2015/9/8/chartex" xmlns:cx2="http://schemas.microsoft.com/office/drawing/2015/10/21/chartex" xmlns:cx3="http://schemas.microsoft.com/office/drawing/2016/5/9/chartex" xmlns:cx4="http://schemas.microsoft.com/office/drawing/2016/5/10/chartex" xmlns:cx5="http://schemas.microsoft.com/office/drawing/2016/5/11/chartex" xmlns:cx6="http://schemas.microsoft.com/office/drawing/2016/5/12/chartex" xmlns:cx7="http://schemas.microsoft.com/office/drawing/2016/5/13/chartex" xmlns:cx8="http://schemas.microsoft.com/office/drawing/2016/5/14/chartex" xmlns:mc="http://schemas.openxmlformats.org/markup-compatibility/2006" xmlns:aink="http://schemas.microsoft.com/office/drawing/2016/ink" xmlns:am3d="http://schemas.microsoft.com/office/drawing/2017/model3d" xmlns:o="urn:schemas-microsoft-com:office:office" xmlns:r="http://schemas.openxmlformats.org/officeDocument/2006/relationships" xmlns:m="http://schemas.openxmlformats.org/officeDocument/2006/math" xmlns:v="urn:schemas-microsoft-com:vml" xmlns:wp14="http://schemas.microsoft.com/office/word/2010/wordprocessingDrawing" xmlns:wp="http://schemas.openxmlformats.org/drawingml/2006/wordprocessingDrawing" xmlns:w10="urn:schemas-microsoft-com:office:word" xmlns:w="http://schemas.openxmlformats.org/wordprocessingml/2006/main" xmlns:w14="http://schemas.microsoft.com/office/word/2010/wordml" xmlns:w15="http://schemas.microsoft.com/office/word/2012/wordml" xmlns:w16cid="http://schemas.microsoft.com/office/word/2016/wordml/cid" xmlns:w16se="http://schemas.microsoft.com/office/word/2015/wordml/symex" xmlns:wpg="http://schemas.microsoft.com/office/word/2010/wordprocessingGroup" xmlns:wpi="http://schemas.microsoft.com/office/word/2010/wordprocessingInk" xmlns:wne="http://schemas.microsoft.com/office/word/2006/wordml" xmlns:wps="http://schemas.microsoft.com/office/word/2010/wordprocessingShape" mc:Ignorable="w14 w15 w16se w16cid wp14">
   <w:body>
     <w:p>
       <w:pPr>
@@ -82,7 +82,7 @@
               </wp:anchor>
             </w:drawing>
           </mc:Choice>
-          <mc:Fallback>
+          <mc:Fallback xmlns:w16sdtdh="http://schemas.microsoft.com/office/word/2020/wordml/sdtdatahash" xmlns:w16="http://schemas.microsoft.com/office/word/2018/wordml" xmlns:w16cex="http://schemas.microsoft.com/office/word/2018/wordml/cex">
             <w:pict>
               <v:rect w14:anchorId="6BF2BDCB" id="Rectángulo 3" o:spid="_x0000_s1026" alt="rectángulo blanco para texto en portada" style="position:absolute;margin-left:-15.95pt;margin-top:73.85pt;width:310.15pt;height:681.65pt;z-index:-251656192;visibility:visible;mso-wrap-style:square;mso-width-percent:0;mso-height-percent:0;mso-wrap-distance-left:9pt;mso-wrap-distance-top:0;mso-wrap-distance-right:9pt;mso-wrap-distance-bottom:0;mso-position-horizontal:absolute;mso-position-horizontal-relative:text;mso-position-vertical:absolute;mso-position-vertical-relative:page;mso-width-percent:0;mso-height-percent:0;mso-width-relative:margin;mso-height-relative:margin;v-text-anchor:middle" o:gfxdata="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" fillcolor="white [3212]" stroked="f" strokeweight="2pt">
                 <w10:wrap anchory="page"/>
@@ -288,7 +288,7 @@
                     </wp:inline>
                   </w:drawing>
                 </mc:Choice>
-                <mc:Fallback>
+                <mc:Fallback xmlns:w16sdtdh="http://schemas.microsoft.com/office/word/2020/wordml/sdtdatahash" xmlns:w16="http://schemas.microsoft.com/office/word/2018/wordml" xmlns:w16cex="http://schemas.microsoft.com/office/word/2018/wordml/cex">
                   <w:pict>
                     <v:shapetype w14:anchorId="0CB9EEAA" id="_x0000_t202" coordsize="21600,21600" o:spt="202" path="m,l,21600r21600,l21600,xe">
                       <v:stroke joinstyle="miter"/>
@@ -412,7 +412,7 @@
                     </wp:inline>
                   </w:drawing>
                 </mc:Choice>
-                <mc:Fallback xmlns:oel="http://schemas.microsoft.com/office/2019/extlst">
+                <mc:Fallback xmlns:oel="http://schemas.microsoft.com/office/2019/extlst" xmlns:w16sdtdh="http://schemas.microsoft.com/office/word/2020/wordml/sdtdatahash" xmlns:w16="http://schemas.microsoft.com/office/word/2018/wordml" xmlns:w16cex="http://schemas.microsoft.com/office/word/2018/wordml/cex">
                   <w:pict>
                     <v:line w14:anchorId="3C7809CC" id="Conector recto 5" o:spid="_x0000_s1026" alt="divisor de texto" style="visibility:visible;mso-wrap-style:square;mso-left-percent:-10001;mso-top-percent:-10001;mso-position-horizontal:absolute;mso-position-horizontal-relative:char;mso-position-vertical:absolute;mso-position-vertical-relative:line;mso-left-percent:-10001;mso-top-percent:-10001" from="0,0" to="109.5pt,0" o:gfxdata="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" strokecolor="#082a75 [3215]" strokeweight="3pt">
                       <w10:anchorlock/>
@@ -514,7 +514,7 @@
                     <w:noProof/>
                     <w:lang w:bidi="es-ES"/>
                   </w:rPr>
-                  <w:t>29 abril</w:t>
+                  <w:t>1 mayo</w:t>
                 </w:r>
                 <w:r>
                   <w:rPr>
@@ -590,7 +590,7 @@
                     </wp:inline>
                   </w:drawing>
                 </mc:Choice>
-                <mc:Fallback xmlns:oel="http://schemas.microsoft.com/office/2019/extlst">
+                <mc:Fallback xmlns:oel="http://schemas.microsoft.com/office/2019/extlst" xmlns:w16sdtdh="http://schemas.microsoft.com/office/word/2020/wordml/sdtdatahash" xmlns:w16="http://schemas.microsoft.com/office/word/2018/wordml" xmlns:w16cex="http://schemas.microsoft.com/office/word/2018/wordml/cex">
                   <w:pict>
                     <v:line w14:anchorId="2EAC2734" id="Conector recto 6" o:spid="_x0000_s1026" alt="divisor de texto" style="visibility:visible;mso-wrap-style:square;mso-left-percent:-10001;mso-top-percent:-10001;mso-position-horizontal:absolute;mso-position-horizontal-relative:char;mso-position-vertical:absolute;mso-position-vertical-relative:line;mso-left-percent:-10001;mso-top-percent:-10001" from="0,0" to="117.65pt,0" o:gfxdata="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" strokecolor="#082a75 [3215]" strokeweight="3pt">
                       <w10:anchorlock/>
@@ -846,7 +846,7 @@
               </wp:anchor>
             </w:drawing>
           </mc:Choice>
-          <mc:Fallback>
+          <mc:Fallback xmlns:w16sdtdh="http://schemas.microsoft.com/office/word/2020/wordml/sdtdatahash" xmlns:w16="http://schemas.microsoft.com/office/word/2018/wordml" xmlns:w16cex="http://schemas.microsoft.com/office/word/2018/wordml/cex">
             <w:pict>
               <v:rect w14:anchorId="512C869B" id="Rectángulo 2" o:spid="_x0000_s1026" alt="rectángulo de color" style="position:absolute;margin-left:-58.7pt;margin-top:525pt;width:611.1pt;height:316.5pt;z-index:-251657216;visibility:visible;mso-wrap-style:square;mso-height-percent:0;mso-wrap-distance-left:9pt;mso-wrap-distance-top:0;mso-wrap-distance-right:9pt;mso-wrap-distance-bottom:0;mso-position-horizontal:absolute;mso-position-horizontal-relative:text;mso-position-vertical:absolute;mso-position-vertical-relative:page;mso-height-percent:0;mso-height-relative:margin;v-text-anchor:middle" o:gfxdata="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" fillcolor="#34aba2 [3206]" stroked="f" strokeweight="2pt">
                 <w10:wrap anchory="page"/>
@@ -2177,8 +2177,21 @@
       <w:r>
         <w:t xml:space="preserve"> </w:t>
       </w:r>
-      <w:r>
-        <w:t>Nathalia Mejia Buitrago.</w:t>
+      <w:proofErr w:type="spellStart"/>
+      <w:r>
+        <w:t>Nathalia</w:t>
+      </w:r>
+      <w:proofErr w:type="spellEnd"/>
+      <w:r>
+        <w:t xml:space="preserve"> </w:t>
+      </w:r>
+      <w:proofErr w:type="spellStart"/>
+      <w:r>
+        <w:t>Mejia</w:t>
+      </w:r>
+      <w:proofErr w:type="spellEnd"/>
+      <w:r>
+        <w:t xml:space="preserve"> Buitrago.</w:t>
       </w:r>
     </w:p>
     <w:p>
@@ -2230,8 +2243,21 @@
       <w:r>
         <w:t xml:space="preserve"> </w:t>
       </w:r>
-      <w:r>
-        <w:t>Nathalia Mejia Buitrago.</w:t>
+      <w:proofErr w:type="spellStart"/>
+      <w:r>
+        <w:t>Nathalia</w:t>
+      </w:r>
+      <w:proofErr w:type="spellEnd"/>
+      <w:r>
+        <w:t xml:space="preserve"> </w:t>
+      </w:r>
+      <w:proofErr w:type="spellStart"/>
+      <w:r>
+        <w:t>Mejia</w:t>
+      </w:r>
+      <w:proofErr w:type="spellEnd"/>
+      <w:r>
+        <w:t xml:space="preserve"> Buitrago.</w:t>
       </w:r>
     </w:p>
     <w:p>
@@ -2268,8 +2294,21 @@
       <w:r>
         <w:t xml:space="preserve"> </w:t>
       </w:r>
-      <w:r>
-        <w:t xml:space="preserve">Nathalia Mejia Buitrago </w:t>
+      <w:proofErr w:type="spellStart"/>
+      <w:r>
+        <w:t>Nathalia</w:t>
+      </w:r>
+      <w:proofErr w:type="spellEnd"/>
+      <w:r>
+        <w:t xml:space="preserve"> </w:t>
+      </w:r>
+      <w:proofErr w:type="spellStart"/>
+      <w:r>
+        <w:t>Mejia</w:t>
+      </w:r>
+      <w:proofErr w:type="spellEnd"/>
+      <w:r>
+        <w:t xml:space="preserve"> Buitrago </w:t>
       </w:r>
       <w:r>
         <w:t>- Isaura Alexandra Banguera Ruiz.</w:t>
@@ -2322,8 +2361,21 @@
         </w:rPr>
         <w:t xml:space="preserve"> </w:t>
       </w:r>
-      <w:r>
-        <w:t xml:space="preserve">Nathalia Mejia </w:t>
+      <w:proofErr w:type="spellStart"/>
+      <w:r>
+        <w:t>Nathalia</w:t>
+      </w:r>
+      <w:proofErr w:type="spellEnd"/>
+      <w:r>
+        <w:t xml:space="preserve"> </w:t>
+      </w:r>
+      <w:proofErr w:type="spellStart"/>
+      <w:r>
+        <w:t>Mejia</w:t>
+      </w:r>
+      <w:proofErr w:type="spellEnd"/>
+      <w:r>
+        <w:t xml:space="preserve"> </w:t>
       </w:r>
       <w:proofErr w:type="gramStart"/>
       <w:r>
@@ -4793,7 +4845,19 @@
           <w:p>
             <w:bookmarkStart w:id="1" w:name="_Hlk227971386"/>
             <w:r>
-              <w:t>25/04/2026-29/04/2026</w:t>
+              <w:t>25/04/2026-</w:t>
+            </w:r>
+            <w:r>
+              <w:t>01</w:t>
+            </w:r>
+            <w:r>
+              <w:t>/0</w:t>
+            </w:r>
+            <w:r>
+              <w:t>5</w:t>
+            </w:r>
+            <w:r>
+              <w:t>/2026</w:t>
             </w:r>
           </w:p>
         </w:tc>
@@ -4814,7 +4878,42 @@
                 <w:b w:val="0"/>
                 <w:bCs/>
               </w:rPr>
-              <w:t>30/04/2026-05/05/2026</w:t>
+              <w:t>02</w:t>
+            </w:r>
+            <w:r>
+              <w:rPr>
+                <w:b w:val="0"/>
+                <w:bCs/>
+              </w:rPr>
+              <w:t>/</w:t>
+            </w:r>
+            <w:r>
+              <w:rPr>
+                <w:b w:val="0"/>
+                <w:bCs/>
+              </w:rPr>
+              <w:t>05</w:t>
+            </w:r>
+            <w:r>
+              <w:rPr>
+                <w:b w:val="0"/>
+                <w:bCs/>
+              </w:rPr>
+              <w:t>/2026-0</w:t>
+            </w:r>
+            <w:r>
+              <w:rPr>
+                <w:b w:val="0"/>
+                <w:bCs/>
+              </w:rPr>
+              <w:t>6</w:t>
+            </w:r>
+            <w:r>
+              <w:rPr>
+                <w:b w:val="0"/>
+                <w:bCs/>
+              </w:rPr>
+              <w:t>/05/2026</w:t>
             </w:r>
           </w:p>
         </w:tc>
@@ -4835,12 +4934,39 @@
                 <w:b w:val="0"/>
                 <w:bCs/>
               </w:rPr>
-              <w:t>06/05/2026-08/04/2026</w:t>
+              <w:t>0</w:t>
+            </w:r>
+            <w:r>
+              <w:rPr>
+                <w:b w:val="0"/>
+                <w:bCs/>
+              </w:rPr>
+              <w:t>7</w:t>
+            </w:r>
+            <w:r>
+              <w:rPr>
+                <w:b w:val="0"/>
+                <w:bCs/>
+              </w:rPr>
+              <w:t>/05/2026-0</w:t>
+            </w:r>
+            <w:r>
+              <w:rPr>
+                <w:b w:val="0"/>
+                <w:bCs/>
+              </w:rPr>
+              <w:t>9</w:t>
+            </w:r>
+            <w:r>
+              <w:rPr>
+                <w:b w:val="0"/>
+                <w:bCs/>
+              </w:rPr>
+              <w:t>/04/2026</w:t>
             </w:r>
           </w:p>
         </w:tc>
       </w:tr>
-      <w:bookmarkEnd w:id="1"/>
     </w:tbl>
     <w:p>
       <w:pPr>
@@ -4853,6 +4979,9 @@
           <w:docGrid w:linePitch="382"/>
         </w:sectPr>
       </w:pPr>
+      <w:bookmarkStart w:id="2" w:name="_GoBack"/>
+      <w:bookmarkEnd w:id="1"/>
+      <w:bookmarkEnd w:id="2"/>
     </w:p>
     <w:p>
       <w:pPr>
@@ -4903,8 +5032,17 @@
           <w:rStyle w:val="nfasis"/>
           <w:rFonts w:asciiTheme="minorHAnsi" w:hAnsiTheme="minorHAnsi" w:cstheme="minorHAnsi"/>
         </w:rPr>
-        <w:t xml:space="preserve"> Scrum Guide</w:t>
-      </w:r>
+        <w:t xml:space="preserve"> Scrum </w:t>
+      </w:r>
+      <w:proofErr w:type="spellStart"/>
+      <w:r>
+        <w:rPr>
+          <w:rStyle w:val="nfasis"/>
+          <w:rFonts w:asciiTheme="minorHAnsi" w:hAnsiTheme="minorHAnsi" w:cstheme="minorHAnsi"/>
+        </w:rPr>
+        <w:t>Guide</w:t>
+      </w:r>
+      <w:proofErr w:type="spellEnd"/>
       <w:r>
         <w:rPr>
           <w:rFonts w:asciiTheme="minorHAnsi" w:hAnsiTheme="minorHAnsi" w:cstheme="minorHAnsi"/>
@@ -4977,7 +5115,23 @@
           <w:rStyle w:val="nfasis"/>
           <w:rFonts w:asciiTheme="minorHAnsi" w:hAnsiTheme="minorHAnsi" w:cstheme="minorHAnsi"/>
         </w:rPr>
-        <w:t xml:space="preserve"> Guide </w:t>
+        <w:t xml:space="preserve"> </w:t>
+      </w:r>
+      <w:proofErr w:type="spellStart"/>
+      <w:r>
+        <w:rPr>
+          <w:rStyle w:val="nfasis"/>
+          <w:rFonts w:asciiTheme="minorHAnsi" w:hAnsiTheme="minorHAnsi" w:cstheme="minorHAnsi"/>
+        </w:rPr>
+        <w:t>Guide</w:t>
+      </w:r>
+      <w:proofErr w:type="spellEnd"/>
+      <w:r>
+        <w:rPr>
+          <w:rStyle w:val="nfasis"/>
+          <w:rFonts w:asciiTheme="minorHAnsi" w:hAnsiTheme="minorHAnsi" w:cstheme="minorHAnsi"/>
+        </w:rPr>
+        <w:t xml:space="preserve"> </w:t>
       </w:r>
       <w:proofErr w:type="spellStart"/>
       <w:r>
@@ -5205,7 +5359,7 @@
 </file>
 
 <file path=word/endnotes.xml><?xml version="1.0" encoding="utf-8"?>
-<w:endnotes xmlns:wpc="http://schemas.microsoft.com/office/word/2010/wordprocessingCanvas" xmlns:cx="http://schemas.microsoft.com/office/drawing/2014/chartex" xmlns:cx1="http://schemas.microsoft.com/office/drawing/2015/9/8/chartex" xmlns:cx2="http://schemas.microsoft.com/office/drawing/2015/10/21/chartex" xmlns:cx3="http://schemas.microsoft.com/office/drawing/2016/5/9/chartex" xmlns:cx4="http://schemas.microsoft.com/office/drawing/2016/5/10/chartex" xmlns:cx5="http://schemas.microsoft.com/office/drawing/2016/5/11/chartex" xmlns:cx6="http://schemas.microsoft.com/office/drawing/2016/5/12/chartex" xmlns:cx7="http://schemas.microsoft.com/office/drawing/2016/5/13/chartex" xmlns:cx8="http://schemas.microsoft.com/office/drawing/2016/5/14/chartex" xmlns:mc="http://schemas.openxmlformats.org/markup-compatibility/2006" xmlns:aink="http://schemas.microsoft.com/office/drawing/2016/ink" xmlns:am3d="http://schemas.microsoft.com/office/drawing/2017/model3d" xmlns:o="urn:schemas-microsoft-com:office:office" xmlns:r="http://schemas.openxmlformats.org/officeDocument/2006/relationships" xmlns:m="http://schemas.openxmlformats.org/officeDocument/2006/math" xmlns:v="urn:schemas-microsoft-com:vml" xmlns:wp14="http://schemas.microsoft.com/office/word/2010/wordprocessingDrawing" xmlns:wp="http://schemas.openxmlformats.org/drawingml/2006/wordprocessingDrawing" xmlns:w10="urn:schemas-microsoft-com:office:word" xmlns:w="http://schemas.openxmlformats.org/wordprocessingml/2006/main" xmlns:w14="http://schemas.microsoft.com/office/word/2010/wordml" xmlns:w15="http://schemas.microsoft.com/office/word/2012/wordml" xmlns:w16cex="http://schemas.microsoft.com/office/word/2018/wordml/cex" xmlns:w16cid="http://schemas.microsoft.com/office/word/2016/wordml/cid" xmlns:w16="http://schemas.microsoft.com/office/word/2018/wordml" xmlns:w16sdtdh="http://schemas.microsoft.com/office/word/2020/wordml/sdtdatahash" xmlns:w16se="http://schemas.microsoft.com/office/word/2015/wordml/symex" xmlns:wpg="http://schemas.microsoft.com/office/word/2010/wordprocessingGroup" xmlns:wpi="http://schemas.microsoft.com/office/word/2010/wordprocessingInk" xmlns:wne="http://schemas.microsoft.com/office/word/2006/wordml" xmlns:wps="http://schemas.microsoft.com/office/word/2010/wordprocessingShape" mc:Ignorable="w14 w15 w16se w16cid w16 w16cex w16sdtdh wp14">
+<w:endnotes xmlns:wpc="http://schemas.microsoft.com/office/word/2010/wordprocessingCanvas" xmlns:cx="http://schemas.microsoft.com/office/drawing/2014/chartex" xmlns:cx1="http://schemas.microsoft.com/office/drawing/2015/9/8/chartex" xmlns:cx2="http://schemas.microsoft.com/office/drawing/2015/10/21/chartex" xmlns:cx3="http://schemas.microsoft.com/office/drawing/2016/5/9/chartex" xmlns:cx4="http://schemas.microsoft.com/office/drawing/2016/5/10/chartex" xmlns:cx5="http://schemas.microsoft.com/office/drawing/2016/5/11/chartex" xmlns:cx6="http://schemas.microsoft.com/office/drawing/2016/5/12/chartex" xmlns:cx7="http://schemas.microsoft.com/office/drawing/2016/5/13/chartex" xmlns:cx8="http://schemas.microsoft.com/office/drawing/2016/5/14/chartex" xmlns:mc="http://schemas.openxmlformats.org/markup-compatibility/2006" xmlns:aink="http://schemas.microsoft.com/office/drawing/2016/ink" xmlns:am3d="http://schemas.microsoft.com/office/drawing/2017/model3d" xmlns:o="urn:schemas-microsoft-com:office:office" xmlns:r="http://schemas.openxmlformats.org/officeDocument/2006/relationships" xmlns:m="http://schemas.openxmlformats.org/officeDocument/2006/math" xmlns:v="urn:schemas-microsoft-com:vml" xmlns:wp14="http://schemas.microsoft.com/office/word/2010/wordprocessingDrawing" xmlns:wp="http://schemas.openxmlformats.org/drawingml/2006/wordprocessingDrawing" xmlns:w10="urn:schemas-microsoft-com:office:word" xmlns:w="http://schemas.openxmlformats.org/wordprocessingml/2006/main" xmlns:w14="http://schemas.microsoft.com/office/word/2010/wordml" xmlns:w15="http://schemas.microsoft.com/office/word/2012/wordml" xmlns:w16cid="http://schemas.microsoft.com/office/word/2016/wordml/cid" xmlns:w16se="http://schemas.microsoft.com/office/word/2015/wordml/symex" xmlns:wpg="http://schemas.microsoft.com/office/word/2010/wordprocessingGroup" xmlns:wpi="http://schemas.microsoft.com/office/word/2010/wordprocessingInk" xmlns:wne="http://schemas.microsoft.com/office/word/2006/wordml" xmlns:wps="http://schemas.microsoft.com/office/word/2010/wordprocessingShape" mc:Ignorable="w14 w15 w16se w16cid wp14">
   <w:endnote w:type="separator" w:id="-1">
     <w:p>
       <w:r>
@@ -5226,7 +5380,7 @@
 </file>
 
 <file path=word/footer1.xml><?xml version="1.0" encoding="utf-8"?>
-<w:ftr xmlns:wpc="http://schemas.microsoft.com/office/word/2010/wordprocessingCanvas" xmlns:cx="http://schemas.microsoft.com/office/drawing/2014/chartex" xmlns:cx1="http://schemas.microsoft.com/office/drawing/2015/9/8/chartex" xmlns:cx2="http://schemas.microsoft.com/office/drawing/2015/10/21/chartex" xmlns:cx3="http://schemas.microsoft.com/office/drawing/2016/5/9/chartex" xmlns:cx4="http://schemas.microsoft.com/office/drawing/2016/5/10/chartex" xmlns:cx5="http://schemas.microsoft.com/office/drawing/2016/5/11/chartex" xmlns:cx6="http://schemas.microsoft.com/office/drawing/2016/5/12/chartex" xmlns:cx7="http://schemas.microsoft.com/office/drawing/2016/5/13/chartex" xmlns:cx8="http://schemas.microsoft.com/office/drawing/2016/5/14/chartex" xmlns:mc="http://schemas.openxmlformats.org/markup-compatibility/2006" xmlns:aink="http://schemas.microsoft.com/office/drawing/2016/ink" xmlns:am3d="http://schemas.microsoft.com/office/drawing/2017/model3d" xmlns:o="urn:schemas-microsoft-com:office:office" xmlns:r="http://schemas.openxmlformats.org/officeDocument/2006/relationships" xmlns:m="http://schemas.openxmlformats.org/officeDocument/2006/math" xmlns:v="urn:schemas-microsoft-com:vml" xmlns:wp14="http://schemas.microsoft.com/office/word/2010/wordprocessingDrawing" xmlns:wp="http://schemas.openxmlformats.org/drawingml/2006/wordprocessingDrawing" xmlns:w10="urn:schemas-microsoft-com:office:word" xmlns:w="http://schemas.openxmlformats.org/wordprocessingml/2006/main" xmlns:w14="http://schemas.microsoft.com/office/word/2010/wordml" xmlns:w15="http://schemas.microsoft.com/office/word/2012/wordml" xmlns:w16cex="http://schemas.microsoft.com/office/word/2018/wordml/cex" xmlns:w16cid="http://schemas.microsoft.com/office/word/2016/wordml/cid" xmlns:w16="http://schemas.microsoft.com/office/word/2018/wordml" xmlns:w16sdtdh="http://schemas.microsoft.com/office/word/2020/wordml/sdtdatahash" xmlns:w16se="http://schemas.microsoft.com/office/word/2015/wordml/symex" xmlns:wpg="http://schemas.microsoft.com/office/word/2010/wordprocessingGroup" xmlns:wpi="http://schemas.microsoft.com/office/word/2010/wordprocessingInk" xmlns:wne="http://schemas.microsoft.com/office/word/2006/wordml" xmlns:wps="http://schemas.microsoft.com/office/word/2010/wordprocessingShape" mc:Ignorable="w14 w15 w16se w16cid w16 w16cex w16sdtdh wp14">
+<w:ftr xmlns:wpc="http://schemas.microsoft.com/office/word/2010/wordprocessingCanvas" xmlns:cx="http://schemas.microsoft.com/office/drawing/2014/chartex" xmlns:cx1="http://schemas.microsoft.com/office/drawing/2015/9/8/chartex" xmlns:cx2="http://schemas.microsoft.com/office/drawing/2015/10/21/chartex" xmlns:cx3="http://schemas.microsoft.com/office/drawing/2016/5/9/chartex" xmlns:cx4="http://schemas.microsoft.com/office/drawing/2016/5/10/chartex" xmlns:cx5="http://schemas.microsoft.com/office/drawing/2016/5/11/chartex" xmlns:cx6="http://schemas.microsoft.com/office/drawing/2016/5/12/chartex" xmlns:cx7="http://schemas.microsoft.com/office/drawing/2016/5/13/chartex" xmlns:cx8="http://schemas.microsoft.com/office/drawing/2016/5/14/chartex" xmlns:mc="http://schemas.openxmlformats.org/markup-compatibility/2006" xmlns:aink="http://schemas.microsoft.com/office/drawing/2016/ink" xmlns:am3d="http://schemas.microsoft.com/office/drawing/2017/model3d" xmlns:o="urn:schemas-microsoft-com:office:office" xmlns:r="http://schemas.openxmlformats.org/officeDocument/2006/relationships" xmlns:m="http://schemas.openxmlformats.org/officeDocument/2006/math" xmlns:v="urn:schemas-microsoft-com:vml" xmlns:wp14="http://schemas.microsoft.com/office/word/2010/wordprocessingDrawing" xmlns:wp="http://schemas.openxmlformats.org/drawingml/2006/wordprocessingDrawing" xmlns:w10="urn:schemas-microsoft-com:office:word" xmlns:w="http://schemas.openxmlformats.org/wordprocessingml/2006/main" xmlns:w14="http://schemas.microsoft.com/office/word/2010/wordml" xmlns:w15="http://schemas.microsoft.com/office/word/2012/wordml" xmlns:w16cid="http://schemas.microsoft.com/office/word/2016/wordml/cid" xmlns:w16se="http://schemas.microsoft.com/office/word/2015/wordml/symex" xmlns:wpg="http://schemas.microsoft.com/office/word/2010/wordprocessingGroup" xmlns:wpi="http://schemas.microsoft.com/office/word/2010/wordprocessingInk" xmlns:wne="http://schemas.microsoft.com/office/word/2006/wordml" xmlns:wps="http://schemas.microsoft.com/office/word/2010/wordprocessingShape" mc:Ignorable="w14 w15 w16se w16cid wp14">
   <w:sdt>
     <w:sdtPr>
       <w:rPr>
@@ -5298,7 +5452,7 @@
 </file>
 
 <file path=word/footnotes.xml><?xml version="1.0" encoding="utf-8"?>
-<w:footnotes xmlns:wpc="http://schemas.microsoft.com/office/word/2010/wordprocessingCanvas" xmlns:cx="http://schemas.microsoft.com/office/drawing/2014/chartex" xmlns:cx1="http://schemas.microsoft.com/office/drawing/2015/9/8/chartex" xmlns:cx2="http://schemas.microsoft.com/office/drawing/2015/10/21/chartex" xmlns:cx3="http://schemas.microsoft.com/office/drawing/2016/5/9/chartex" xmlns:cx4="http://schemas.microsoft.com/office/drawing/2016/5/10/chartex" xmlns:cx5="http://schemas.microsoft.com/office/drawing/2016/5/11/chartex" xmlns:cx6="http://schemas.microsoft.com/office/drawing/2016/5/12/chartex" xmlns:cx7="http://schemas.microsoft.com/office/drawing/2016/5/13/chartex" xmlns:cx8="http://schemas.microsoft.com/office/drawing/2016/5/14/chartex" xmlns:mc="http://schemas.openxmlformats.org/markup-compatibility/2006" xmlns:aink="http://schemas.microsoft.com/office/drawing/2016/ink" xmlns:am3d="http://schemas.microsoft.com/office/drawing/2017/model3d" xmlns:o="urn:schemas-microsoft-com:office:office" xmlns:r="http://schemas.openxmlformats.org/officeDocument/2006/relationships" xmlns:m="http://schemas.openxmlformats.org/officeDocument/2006/math" xmlns:v="urn:schemas-microsoft-com:vml" xmlns:wp14="http://schemas.microsoft.com/office/word/2010/wordprocessingDrawing" xmlns:wp="http://schemas.openxmlformats.org/drawingml/2006/wordprocessingDrawing" xmlns:w10="urn:schemas-microsoft-com:office:word" xmlns:w="http://schemas.openxmlformats.org/wordprocessingml/2006/main" xmlns:w14="http://schemas.microsoft.com/office/word/2010/wordml" xmlns:w15="http://schemas.microsoft.com/office/word/2012/wordml" xmlns:w16cex="http://schemas.microsoft.com/office/word/2018/wordml/cex" xmlns:w16cid="http://schemas.microsoft.com/office/word/2016/wordml/cid" xmlns:w16="http://schemas.microsoft.com/office/word/2018/wordml" xmlns:w16sdtdh="http://schemas.microsoft.com/office/word/2020/wordml/sdtdatahash" xmlns:w16se="http://schemas.microsoft.com/office/word/2015/wordml/symex" xmlns:wpg="http://schemas.microsoft.com/office/word/2010/wordprocessingGroup" xmlns:wpi="http://schemas.microsoft.com/office/word/2010/wordprocessingInk" xmlns:wne="http://schemas.microsoft.com/office/word/2006/wordml" xmlns:wps="http://schemas.microsoft.com/office/word/2010/wordprocessingShape" mc:Ignorable="w14 w15 w16se w16cid w16 w16cex w16sdtdh wp14">
+<w:footnotes xmlns:wpc="http://schemas.microsoft.com/office/word/2010/wordprocessingCanvas" xmlns:cx="http://schemas.microsoft.com/office/drawing/2014/chartex" xmlns:cx1="http://schemas.microsoft.com/office/drawing/2015/9/8/chartex" xmlns:cx2="http://schemas.microsoft.com/office/drawing/2015/10/21/chartex" xmlns:cx3="http://schemas.microsoft.com/office/drawing/2016/5/9/chartex" xmlns:cx4="http://schemas.microsoft.com/office/drawing/2016/5/10/chartex" xmlns:cx5="http://schemas.microsoft.com/office/drawing/2016/5/11/chartex" xmlns:cx6="http://schemas.microsoft.com/office/drawing/2016/5/12/chartex" xmlns:cx7="http://schemas.microsoft.com/office/drawing/2016/5/13/chartex" xmlns:cx8="http://schemas.microsoft.com/office/drawing/2016/5/14/chartex" xmlns:mc="http://schemas.openxmlformats.org/markup-compatibility/2006" xmlns:aink="http://schemas.microsoft.com/office/drawing/2016/ink" xmlns:am3d="http://schemas.microsoft.com/office/drawing/2017/model3d" xmlns:o="urn:schemas-microsoft-com:office:office" xmlns:r="http://schemas.openxmlformats.org/officeDocument/2006/relationships" xmlns:m="http://schemas.openxmlformats.org/officeDocument/2006/math" xmlns:v="urn:schemas-microsoft-com:vml" xmlns:wp14="http://schemas.microsoft.com/office/word/2010/wordprocessingDrawing" xmlns:wp="http://schemas.openxmlformats.org/drawingml/2006/wordprocessingDrawing" xmlns:w10="urn:schemas-microsoft-com:office:word" xmlns:w="http://schemas.openxmlformats.org/wordprocessingml/2006/main" xmlns:w14="http://schemas.microsoft.com/office/word/2010/wordml" xmlns:w15="http://schemas.microsoft.com/office/word/2012/wordml" xmlns:w16cid="http://schemas.microsoft.com/office/word/2016/wordml/cid" xmlns:w16se="http://schemas.microsoft.com/office/word/2015/wordml/symex" xmlns:wpg="http://schemas.microsoft.com/office/word/2010/wordprocessingGroup" xmlns:wpi="http://schemas.microsoft.com/office/word/2010/wordprocessingInk" xmlns:wne="http://schemas.microsoft.com/office/word/2006/wordml" xmlns:wps="http://schemas.microsoft.com/office/word/2010/wordprocessingShape" mc:Ignorable="w14 w15 w16se w16cid wp14">
   <w:footnote w:type="separator" w:id="-1">
     <w:p>
       <w:r>
@@ -5319,7 +5473,7 @@
 </file>
 
 <file path=word/header1.xml><?xml version="1.0" encoding="utf-8"?>
-<w:hdr xmlns:wpc="http://schemas.microsoft.com/office/word/2010/wordprocessingCanvas" xmlns:cx="http://schemas.microsoft.com/office/drawing/2014/chartex" xmlns:cx1="http://schemas.microsoft.com/office/drawing/2015/9/8/chartex" xmlns:cx2="http://schemas.microsoft.com/office/drawing/2015/10/21/chartex" xmlns:cx3="http://schemas.microsoft.com/office/drawing/2016/5/9/chartex" xmlns:cx4="http://schemas.microsoft.com/office/drawing/2016/5/10/chartex" xmlns:cx5="http://schemas.microsoft.com/office/drawing/2016/5/11/chartex" xmlns:cx6="http://schemas.microsoft.com/office/drawing/2016/5/12/chartex" xmlns:cx7="http://schemas.microsoft.com/office/drawing/2016/5/13/chartex" xmlns:cx8="http://schemas.microsoft.com/office/drawing/2016/5/14/chartex" xmlns:mc="http://schemas.openxmlformats.org/markup-compatibility/2006" xmlns:aink="http://schemas.microsoft.com/office/drawing/2016/ink" xmlns:am3d="http://schemas.microsoft.com/office/drawing/2017/model3d" xmlns:o="urn:schemas-microsoft-com:office:office" xmlns:r="http://schemas.openxmlformats.org/officeDocument/2006/relationships" xmlns:m="http://schemas.openxmlformats.org/officeDocument/2006/math" xmlns:v="urn:schemas-microsoft-com:vml" xmlns:wp14="http://schemas.microsoft.com/office/word/2010/wordprocessingDrawing" xmlns:wp="http://schemas.openxmlformats.org/drawingml/2006/wordprocessingDrawing" xmlns:w10="urn:schemas-microsoft-com:office:word" xmlns:w="http://schemas.openxmlformats.org/wordprocessingml/2006/main" xmlns:w14="http://schemas.microsoft.com/office/word/2010/wordml" xmlns:w15="http://schemas.microsoft.com/office/word/2012/wordml" xmlns:w16cex="http://schemas.microsoft.com/office/word/2018/wordml/cex" xmlns:w16cid="http://schemas.microsoft.com/office/word/2016/wordml/cid" xmlns:w16="http://schemas.microsoft.com/office/word/2018/wordml" xmlns:w16sdtdh="http://schemas.microsoft.com/office/word/2020/wordml/sdtdatahash" xmlns:w16se="http://schemas.microsoft.com/office/word/2015/wordml/symex" xmlns:wpg="http://schemas.microsoft.com/office/word/2010/wordprocessingGroup" xmlns:wpi="http://schemas.microsoft.com/office/word/2010/wordprocessingInk" xmlns:wne="http://schemas.microsoft.com/office/word/2006/wordml" xmlns:wps="http://schemas.microsoft.com/office/word/2010/wordprocessingShape" mc:Ignorable="w14 w15 w16se w16cid w16 w16cex w16sdtdh wp14">
+<w:hdr xmlns:wpc="http://schemas.microsoft.com/office/word/2010/wordprocessingCanvas" xmlns:cx="http://schemas.microsoft.com/office/drawing/2014/chartex" xmlns:cx1="http://schemas.microsoft.com/office/drawing/2015/9/8/chartex" xmlns:cx2="http://schemas.microsoft.com/office/drawing/2015/10/21/chartex" xmlns:cx3="http://schemas.microsoft.com/office/drawing/2016/5/9/chartex" xmlns:cx4="http://schemas.microsoft.com/office/drawing/2016/5/10/chartex" xmlns:cx5="http://schemas.microsoft.com/office/drawing/2016/5/11/chartex" xmlns:cx6="http://schemas.microsoft.com/office/drawing/2016/5/12/chartex" xmlns:cx7="http://schemas.microsoft.com/office/drawing/2016/5/13/chartex" xmlns:cx8="http://schemas.microsoft.com/office/drawing/2016/5/14/chartex" xmlns:mc="http://schemas.openxmlformats.org/markup-compatibility/2006" xmlns:aink="http://schemas.microsoft.com/office/drawing/2016/ink" xmlns:am3d="http://schemas.microsoft.com/office/drawing/2017/model3d" xmlns:o="urn:schemas-microsoft-com:office:office" xmlns:r="http://schemas.openxmlformats.org/officeDocument/2006/relationships" xmlns:m="http://schemas.openxmlformats.org/officeDocument/2006/math" xmlns:v="urn:schemas-microsoft-com:vml" xmlns:wp14="http://schemas.microsoft.com/office/word/2010/wordprocessingDrawing" xmlns:wp="http://schemas.openxmlformats.org/drawingml/2006/wordprocessingDrawing" xmlns:w10="urn:schemas-microsoft-com:office:word" xmlns:w="http://schemas.openxmlformats.org/wordprocessingml/2006/main" xmlns:w14="http://schemas.microsoft.com/office/word/2010/wordml" xmlns:w15="http://schemas.microsoft.com/office/word/2012/wordml" xmlns:w16cid="http://schemas.microsoft.com/office/word/2016/wordml/cid" xmlns:w16se="http://schemas.microsoft.com/office/word/2015/wordml/symex" xmlns:wpg="http://schemas.microsoft.com/office/word/2010/wordprocessingGroup" xmlns:wpi="http://schemas.microsoft.com/office/word/2010/wordprocessingInk" xmlns:wne="http://schemas.microsoft.com/office/word/2006/wordml" xmlns:wps="http://schemas.microsoft.com/office/word/2010/wordprocessingShape" mc:Ignorable="w14 w15 w16se w16cid wp14">
   <w:tbl>
     <w:tblPr>
       <w:tblW w:w="10035" w:type="dxa"/>
@@ -5373,7 +5527,7 @@
 </file>
 
 <file path=word/numbering.xml><?xml version="1.0" encoding="utf-8"?>
-<w:numbering xmlns:wpc="http://schemas.microsoft.com/office/word/2010/wordprocessingCanvas" xmlns:cx="http://schemas.microsoft.com/office/drawing/2014/chartex" xmlns:cx1="http://schemas.microsoft.com/office/drawing/2015/9/8/chartex" xmlns:cx2="http://schemas.microsoft.com/office/drawing/2015/10/21/chartex" xmlns:cx3="http://schemas.microsoft.com/office/drawing/2016/5/9/chartex" xmlns:cx4="http://schemas.microsoft.com/office/drawing/2016/5/10/chartex" xmlns:cx5="http://schemas.microsoft.com/office/drawing/2016/5/11/chartex" xmlns:cx6="http://schemas.microsoft.com/office/drawing/2016/5/12/chartex" xmlns:cx7="http://schemas.microsoft.com/office/drawing/2016/5/13/chartex" xmlns:cx8="http://schemas.microsoft.com/office/drawing/2016/5/14/chartex" xmlns:mc="http://schemas.openxmlformats.org/markup-compatibility/2006" xmlns:aink="http://schemas.microsoft.com/office/drawing/2016/ink" xmlns:am3d="http://schemas.microsoft.com/office/drawing/2017/model3d" xmlns:o="urn:schemas-microsoft-com:office:office" xmlns:r="http://schemas.openxmlformats.org/officeDocument/2006/relationships" xmlns:m="http://schemas.openxmlformats.org/officeDocument/2006/math" xmlns:v="urn:schemas-microsoft-com:vml" xmlns:wp14="http://schemas.microsoft.com/office/word/2010/wordprocessingDrawing" xmlns:wp="http://schemas.openxmlformats.org/drawingml/2006/wordprocessingDrawing" xmlns:w10="urn:schemas-microsoft-com:office:word" xmlns:w="http://schemas.openxmlformats.org/wordprocessingml/2006/main" xmlns:w14="http://schemas.microsoft.com/office/word/2010/wordml" xmlns:w15="http://schemas.microsoft.com/office/word/2012/wordml" xmlns:w16cex="http://schemas.microsoft.com/office/word/2018/wordml/cex" xmlns:w16cid="http://schemas.microsoft.com/office/word/2016/wordml/cid" xmlns:w16="http://schemas.microsoft.com/office/word/2018/wordml" xmlns:w16sdtdh="http://schemas.microsoft.com/office/word/2020/wordml/sdtdatahash" xmlns:w16se="http://schemas.microsoft.com/office/word/2015/wordml/symex" xmlns:wpg="http://schemas.microsoft.com/office/word/2010/wordprocessingGroup" xmlns:wpi="http://schemas.microsoft.com/office/word/2010/wordprocessingInk" xmlns:wne="http://schemas.microsoft.com/office/word/2006/wordml" xmlns:wps="http://schemas.microsoft.com/office/word/2010/wordprocessingShape" mc:Ignorable="w14 w15 w16se w16cid w16 w16cex w16sdtdh wp14">
+<w:numbering xmlns:wpc="http://schemas.microsoft.com/office/word/2010/wordprocessingCanvas" xmlns:cx="http://schemas.microsoft.com/office/drawing/2014/chartex" xmlns:cx1="http://schemas.microsoft.com/office/drawing/2015/9/8/chartex" xmlns:cx2="http://schemas.microsoft.com/office/drawing/2015/10/21/chartex" xmlns:cx3="http://schemas.microsoft.com/office/drawing/2016/5/9/chartex" xmlns:cx4="http://schemas.microsoft.com/office/drawing/2016/5/10/chartex" xmlns:cx5="http://schemas.microsoft.com/office/drawing/2016/5/11/chartex" xmlns:cx6="http://schemas.microsoft.com/office/drawing/2016/5/12/chartex" xmlns:cx7="http://schemas.microsoft.com/office/drawing/2016/5/13/chartex" xmlns:cx8="http://schemas.microsoft.com/office/drawing/2016/5/14/chartex" xmlns:mc="http://schemas.openxmlformats.org/markup-compatibility/2006" xmlns:aink="http://schemas.microsoft.com/office/drawing/2016/ink" xmlns:am3d="http://schemas.microsoft.com/office/drawing/2017/model3d" xmlns:o="urn:schemas-microsoft-com:office:office" xmlns:r="http://schemas.openxmlformats.org/officeDocument/2006/relationships" xmlns:m="http://schemas.openxmlformats.org/officeDocument/2006/math" xmlns:v="urn:schemas-microsoft-com:vml" xmlns:wp14="http://schemas.microsoft.com/office/word/2010/wordprocessingDrawing" xmlns:wp="http://schemas.openxmlformats.org/drawingml/2006/wordprocessingDrawing" xmlns:w10="urn:schemas-microsoft-com:office:word" xmlns:w="http://schemas.openxmlformats.org/wordprocessingml/2006/main" xmlns:w14="http://schemas.microsoft.com/office/word/2010/wordml" xmlns:w15="http://schemas.microsoft.com/office/word/2012/wordml" xmlns:w16cid="http://schemas.microsoft.com/office/word/2016/wordml/cid" xmlns:w16se="http://schemas.microsoft.com/office/word/2015/wordml/symex" xmlns:wpg="http://schemas.microsoft.com/office/word/2010/wordprocessingGroup" xmlns:wpi="http://schemas.microsoft.com/office/word/2010/wordprocessingInk" xmlns:wne="http://schemas.microsoft.com/office/word/2006/wordml" xmlns:wps="http://schemas.microsoft.com/office/word/2010/wordprocessingShape" mc:Ignorable="w14 w15 w16se w16cid wp14">
   <w:abstractNum w:abstractNumId="0" w15:restartNumberingAfterBreak="0">
     <w:nsid w:val="09152359"/>
     <w:multiLevelType w:val="hybridMultilevel"/>
@@ -10472,7 +10626,7 @@
 </file>
 
 <file path=word/styles.xml><?xml version="1.0" encoding="utf-8"?>
-<w:styles xmlns:mc="http://schemas.openxmlformats.org/markup-compatibility/2006" xmlns:r="http://schemas.openxmlformats.org/officeDocument/2006/relationships" xmlns:w="http://schemas.openxmlformats.org/wordprocessingml/2006/main" xmlns:w14="http://schemas.microsoft.com/office/word/2010/wordml" xmlns:w15="http://schemas.microsoft.com/office/word/2012/wordml" xmlns:w16cex="http://schemas.microsoft.com/office/word/2018/wordml/cex" xmlns:w16cid="http://schemas.microsoft.com/office/word/2016/wordml/cid" xmlns:w16="http://schemas.microsoft.com/office/word/2018/wordml" xmlns:w16sdtdh="http://schemas.microsoft.com/office/word/2020/wordml/sdtdatahash" xmlns:w16se="http://schemas.microsoft.com/office/word/2015/wordml/symex" mc:Ignorable="w14 w15 w16se w16cid w16 w16cex w16sdtdh">
+<w:styles xmlns:mc="http://schemas.openxmlformats.org/markup-compatibility/2006" xmlns:r="http://schemas.openxmlformats.org/officeDocument/2006/relationships" xmlns:w="http://schemas.openxmlformats.org/wordprocessingml/2006/main" xmlns:w14="http://schemas.microsoft.com/office/word/2010/wordml" xmlns:w15="http://schemas.microsoft.com/office/word/2012/wordml" xmlns:w16cid="http://schemas.microsoft.com/office/word/2016/wordml/cid" xmlns:w16se="http://schemas.microsoft.com/office/word/2015/wordml/symex" mc:Ignorable="w14 w15 w16se w16cid">
   <w:docDefaults>
     <w:rPrDefault>
       <w:rPr>
@@ -10488,7 +10642,7 @@
       </w:pPr>
     </w:pPrDefault>
   </w:docDefaults>
-  <w:latentStyles w:defLockedState="0" w:defUIPriority="99" w:defSemiHidden="0" w:defUnhideWhenUsed="0" w:defQFormat="0" w:count="376">
+  <w:latentStyles w:defLockedState="0" w:defUIPriority="99" w:defSemiHidden="0" w:defUnhideWhenUsed="0" w:defQFormat="0" w:count="375">
     <w:lsdException w:name="Normal" w:uiPriority="0" w:qFormat="1"/>
     <w:lsdException w:name="heading 1" w:uiPriority="7" w:qFormat="1"/>
     <w:lsdException w:name="heading 2" w:uiPriority="4" w:qFormat="1"/>
@@ -10864,7 +11018,6 @@
     <w:lsdException w:name="Smart Hyperlink" w:semiHidden="1" w:unhideWhenUsed="1"/>
     <w:lsdException w:name="Hashtag" w:semiHidden="1" w:unhideWhenUsed="1"/>
     <w:lsdException w:name="Unresolved Mention" w:semiHidden="1" w:unhideWhenUsed="1"/>
-    <w:lsdException w:name="Smart Link" w:semiHidden="1" w:unhideWhenUsed="1"/>
   </w:latentStyles>
   <w:style w:type="paragraph" w:default="1" w:styleId="Normal">
     <w:name w:val="Normal"/>
@@ -11481,7 +11634,7 @@
 </file>
 
 <file path=word/glossary/document.xml><?xml version="1.0" encoding="utf-8"?>
-<w:glossaryDocument xmlns:wpc="http://schemas.microsoft.com/office/word/2010/wordprocessingCanvas" xmlns:cx="http://schemas.microsoft.com/office/drawing/2014/chartex" xmlns:cx1="http://schemas.microsoft.com/office/drawing/2015/9/8/chartex" xmlns:cx2="http://schemas.microsoft.com/office/drawing/2015/10/21/chartex" xmlns:cx3="http://schemas.microsoft.com/office/drawing/2016/5/9/chartex" xmlns:cx4="http://schemas.microsoft.com/office/drawing/2016/5/10/chartex" xmlns:cx5="http://schemas.microsoft.com/office/drawing/2016/5/11/chartex" xmlns:cx6="http://schemas.microsoft.com/office/drawing/2016/5/12/chartex" xmlns:cx7="http://schemas.microsoft.com/office/drawing/2016/5/13/chartex" xmlns:cx8="http://schemas.microsoft.com/office/drawing/2016/5/14/chartex" xmlns:mc="http://schemas.openxmlformats.org/markup-compatibility/2006" xmlns:aink="http://schemas.microsoft.com/office/drawing/2016/ink" xmlns:am3d="http://schemas.microsoft.com/office/drawing/2017/model3d" xmlns:o="urn:schemas-microsoft-com:office:office" xmlns:r="http://schemas.openxmlformats.org/officeDocument/2006/relationships" xmlns:m="http://schemas.openxmlformats.org/officeDocument/2006/math" xmlns:v="urn:schemas-microsoft-com:vml" xmlns:wp14="http://schemas.microsoft.com/office/word/2010/wordprocessingDrawing" xmlns:wp="http://schemas.openxmlformats.org/drawingml/2006/wordprocessingDrawing" xmlns:w10="urn:schemas-microsoft-com:office:word" xmlns:w="http://schemas.openxmlformats.org/wordprocessingml/2006/main" xmlns:w14="http://schemas.microsoft.com/office/word/2010/wordml" xmlns:w15="http://schemas.microsoft.com/office/word/2012/wordml" xmlns:w16cex="http://schemas.microsoft.com/office/word/2018/wordml/cex" xmlns:w16cid="http://schemas.microsoft.com/office/word/2016/wordml/cid" xmlns:w16="http://schemas.microsoft.com/office/word/2018/wordml" xmlns:w16sdtdh="http://schemas.microsoft.com/office/word/2020/wordml/sdtdatahash" xmlns:w16se="http://schemas.microsoft.com/office/word/2015/wordml/symex" xmlns:wpg="http://schemas.microsoft.com/office/word/2010/wordprocessingGroup" xmlns:wpi="http://schemas.microsoft.com/office/word/2010/wordprocessingInk" xmlns:wne="http://schemas.microsoft.com/office/word/2006/wordml" xmlns:wps="http://schemas.microsoft.com/office/word/2010/wordprocessingShape" mc:Ignorable="w14 w15 w16se w16cid w16 w16cex w16sdtdh wp14">
+<w:glossaryDocument xmlns:wpc="http://schemas.microsoft.com/office/word/2010/wordprocessingCanvas" xmlns:cx="http://schemas.microsoft.com/office/drawing/2014/chartex" xmlns:cx1="http://schemas.microsoft.com/office/drawing/2015/9/8/chartex" xmlns:cx2="http://schemas.microsoft.com/office/drawing/2015/10/21/chartex" xmlns:cx3="http://schemas.microsoft.com/office/drawing/2016/5/9/chartex" xmlns:cx4="http://schemas.microsoft.com/office/drawing/2016/5/10/chartex" xmlns:cx5="http://schemas.microsoft.com/office/drawing/2016/5/11/chartex" xmlns:cx6="http://schemas.microsoft.com/office/drawing/2016/5/12/chartex" xmlns:cx7="http://schemas.microsoft.com/office/drawing/2016/5/13/chartex" xmlns:cx8="http://schemas.microsoft.com/office/drawing/2016/5/14/chartex" xmlns:mc="http://schemas.openxmlformats.org/markup-compatibility/2006" xmlns:aink="http://schemas.microsoft.com/office/drawing/2016/ink" xmlns:am3d="http://schemas.microsoft.com/office/drawing/2017/model3d" xmlns:o="urn:schemas-microsoft-com:office:office" xmlns:r="http://schemas.openxmlformats.org/officeDocument/2006/relationships" xmlns:m="http://schemas.openxmlformats.org/officeDocument/2006/math" xmlns:v="urn:schemas-microsoft-com:vml" xmlns:wp14="http://schemas.microsoft.com/office/word/2010/wordprocessingDrawing" xmlns:wp="http://schemas.openxmlformats.org/drawingml/2006/wordprocessingDrawing" xmlns:w10="urn:schemas-microsoft-com:office:word" xmlns:w="http://schemas.openxmlformats.org/wordprocessingml/2006/main" xmlns:w14="http://schemas.microsoft.com/office/word/2010/wordml" xmlns:w15="http://schemas.microsoft.com/office/word/2012/wordml" xmlns:w16cid="http://schemas.microsoft.com/office/word/2016/wordml/cid" xmlns:w16se="http://schemas.microsoft.com/office/word/2015/wordml/symex" xmlns:wpg="http://schemas.microsoft.com/office/word/2010/wordprocessingGroup" xmlns:wpi="http://schemas.microsoft.com/office/word/2010/wordprocessingInk" xmlns:wne="http://schemas.microsoft.com/office/word/2006/wordml" xmlns:wps="http://schemas.microsoft.com/office/word/2010/wordprocessingShape" mc:Ignorable="w14 w15 w16se w16cid wp14">
   <w:docParts>
     <w:docPart>
       <w:docPartPr>
@@ -11549,7 +11702,7 @@
 </file>
 
 <file path=word/glossary/fontTable.xml><?xml version="1.0" encoding="utf-8"?>
-<w:fonts xmlns:mc="http://schemas.openxmlformats.org/markup-compatibility/2006" xmlns:r="http://schemas.openxmlformats.org/officeDocument/2006/relationships" xmlns:w="http://schemas.openxmlformats.org/wordprocessingml/2006/main" xmlns:w14="http://schemas.microsoft.com/office/word/2010/wordml" xmlns:w15="http://schemas.microsoft.com/office/word/2012/wordml" xmlns:w16cex="http://schemas.microsoft.com/office/word/2018/wordml/cex" xmlns:w16cid="http://schemas.microsoft.com/office/word/2016/wordml/cid" xmlns:w16="http://schemas.microsoft.com/office/word/2018/wordml" xmlns:w16sdtdh="http://schemas.microsoft.com/office/word/2020/wordml/sdtdatahash" xmlns:w16se="http://schemas.microsoft.com/office/word/2015/wordml/symex" mc:Ignorable="w14 w15 w16se w16cid w16 w16cex w16sdtdh">
+<w:fonts xmlns:mc="http://schemas.openxmlformats.org/markup-compatibility/2006" xmlns:r="http://schemas.openxmlformats.org/officeDocument/2006/relationships" xmlns:w="http://schemas.openxmlformats.org/wordprocessingml/2006/main" xmlns:w14="http://schemas.microsoft.com/office/word/2010/wordml" xmlns:w15="http://schemas.microsoft.com/office/word/2012/wordml" xmlns:w16cid="http://schemas.microsoft.com/office/word/2016/wordml/cid" xmlns:w16se="http://schemas.microsoft.com/office/word/2015/wordml/symex" mc:Ignorable="w14 w15 w16se w16cid">
   <w:font w:name="Calibri">
     <w:panose1 w:val="020F0502020204030204"/>
     <w:charset w:val="00"/>
@@ -11626,7 +11779,7 @@
 </file>
 
 <file path=word/glossary/settings.xml><?xml version="1.0" encoding="utf-8"?>
-<w:settings xmlns:mc="http://schemas.openxmlformats.org/markup-compatibility/2006" xmlns:o="urn:schemas-microsoft-com:office:office" xmlns:r="http://schemas.openxmlformats.org/officeDocument/2006/relationships" xmlns:m="http://schemas.openxmlformats.org/officeDocument/2006/math" xmlns:v="urn:schemas-microsoft-com:vml" xmlns:w10="urn:schemas-microsoft-com:office:word" xmlns:w="http://schemas.openxmlformats.org/wordprocessingml/2006/main" xmlns:w14="http://schemas.microsoft.com/office/word/2010/wordml" xmlns:w15="http://schemas.microsoft.com/office/word/2012/wordml" xmlns:w16cex="http://schemas.microsoft.com/office/word/2018/wordml/cex" xmlns:w16cid="http://schemas.microsoft.com/office/word/2016/wordml/cid" xmlns:w16="http://schemas.microsoft.com/office/word/2018/wordml" xmlns:w16sdtdh="http://schemas.microsoft.com/office/word/2020/wordml/sdtdatahash" xmlns:w16se="http://schemas.microsoft.com/office/word/2015/wordml/symex" xmlns:sl="http://schemas.openxmlformats.org/schemaLibrary/2006/main" mc:Ignorable="w14 w15 w16se w16cid w16 w16cex w16sdtdh">
+<w:settings xmlns:mc="http://schemas.openxmlformats.org/markup-compatibility/2006" xmlns:o="urn:schemas-microsoft-com:office:office" xmlns:r="http://schemas.openxmlformats.org/officeDocument/2006/relationships" xmlns:m="http://schemas.openxmlformats.org/officeDocument/2006/math" xmlns:v="urn:schemas-microsoft-com:vml" xmlns:w10="urn:schemas-microsoft-com:office:word" xmlns:w="http://schemas.openxmlformats.org/wordprocessingml/2006/main" xmlns:w14="http://schemas.microsoft.com/office/word/2010/wordml" xmlns:w15="http://schemas.microsoft.com/office/word/2012/wordml" xmlns:w16cid="http://schemas.microsoft.com/office/word/2016/wordml/cid" xmlns:w16se="http://schemas.microsoft.com/office/word/2015/wordml/symex" xmlns:sl="http://schemas.openxmlformats.org/schemaLibrary/2006/main" mc:Ignorable="w14 w15 w16se w16cid">
   <w:view w:val="normal"/>
   <w:defaultTabStop w:val="708"/>
   <w:hyphenationZone w:val="425"/>
@@ -11645,6 +11798,7 @@
     <w:rsid w:val="000C40E8"/>
     <w:rsid w:val="000D4FAD"/>
     <w:rsid w:val="002E47CA"/>
+    <w:rsid w:val="003F2291"/>
     <w:rsid w:val="00476239"/>
     <w:rsid w:val="0056075F"/>
     <w:rsid w:val="0067171A"/>
@@ -11671,14 +11825,14 @@
   </m:mathPr>
   <w:themeFontLang w:val="es-CO"/>
   <w:clrSchemeMapping w:bg1="light1" w:t1="dark1" w:bg2="light2" w:t2="dark2" w:accent1="accent1" w:accent2="accent2" w:accent3="accent3" w:accent4="accent4" w:accent5="accent5" w:accent6="accent6" w:hyperlink="hyperlink" w:followedHyperlink="followedHyperlink"/>
-  <w:decimalSymbol w:val=","/>
-  <w:listSeparator w:val=";"/>
+  <w:decimalSymbol w:val="."/>
+  <w:listSeparator w:val=","/>
   <w15:chartTrackingRefBased/>
 </w:settings>
 </file>
 
 <file path=word/glossary/styles.xml><?xml version="1.0" encoding="utf-8"?>
-<w:styles xmlns:mc="http://schemas.openxmlformats.org/markup-compatibility/2006" xmlns:r="http://schemas.openxmlformats.org/officeDocument/2006/relationships" xmlns:w="http://schemas.openxmlformats.org/wordprocessingml/2006/main" xmlns:w14="http://schemas.microsoft.com/office/word/2010/wordml" xmlns:w15="http://schemas.microsoft.com/office/word/2012/wordml" xmlns:w16cex="http://schemas.microsoft.com/office/word/2018/wordml/cex" xmlns:w16cid="http://schemas.microsoft.com/office/word/2016/wordml/cid" xmlns:w16="http://schemas.microsoft.com/office/word/2018/wordml" xmlns:w16sdtdh="http://schemas.microsoft.com/office/word/2020/wordml/sdtdatahash" xmlns:w16se="http://schemas.microsoft.com/office/word/2015/wordml/symex" mc:Ignorable="w14 w15 w16se w16cid w16 w16cex w16sdtdh">
+<w:styles xmlns:mc="http://schemas.openxmlformats.org/markup-compatibility/2006" xmlns:r="http://schemas.openxmlformats.org/officeDocument/2006/relationships" xmlns:w="http://schemas.openxmlformats.org/wordprocessingml/2006/main" xmlns:w14="http://schemas.microsoft.com/office/word/2010/wordml" xmlns:w15="http://schemas.microsoft.com/office/word/2012/wordml" xmlns:w16cid="http://schemas.microsoft.com/office/word/2016/wordml/cid" xmlns:w16se="http://schemas.microsoft.com/office/word/2015/wordml/symex" mc:Ignorable="w14 w15 w16se w16cid">
   <w:docDefaults>
     <w:rPrDefault>
       <w:rPr>
@@ -11696,7 +11850,7 @@
       </w:pPr>
     </w:pPrDefault>
   </w:docDefaults>
-  <w:latentStyles w:defLockedState="0" w:defUIPriority="99" w:defSemiHidden="0" w:defUnhideWhenUsed="0" w:defQFormat="0" w:count="376">
+  <w:latentStyles w:defLockedState="0" w:defUIPriority="99" w:defSemiHidden="0" w:defUnhideWhenUsed="0" w:defQFormat="0" w:count="375">
     <w:lsdException w:name="Normal" w:uiPriority="0" w:qFormat="1"/>
     <w:lsdException w:name="heading 1" w:uiPriority="9" w:qFormat="1"/>
     <w:lsdException w:name="heading 2" w:semiHidden="1" w:uiPriority="9" w:unhideWhenUsed="1" w:qFormat="1"/>
@@ -12072,7 +12226,6 @@
     <w:lsdException w:name="Smart Hyperlink" w:semiHidden="1" w:unhideWhenUsed="1"/>
     <w:lsdException w:name="Hashtag" w:semiHidden="1" w:unhideWhenUsed="1"/>
     <w:lsdException w:name="Unresolved Mention" w:semiHidden="1" w:unhideWhenUsed="1"/>
-    <w:lsdException w:name="Smart Link" w:semiHidden="1" w:unhideWhenUsed="1"/>
   </w:latentStyles>
   <w:style w:type="paragraph" w:default="1" w:styleId="Normal">
     <w:name w:val="Normal"/>
@@ -12147,7 +12300,7 @@
 </file>
 
 <file path=word/glossary/webSettings.xml><?xml version="1.0" encoding="utf-8"?>
-<w:webSettings xmlns:mc="http://schemas.openxmlformats.org/markup-compatibility/2006" xmlns:r="http://schemas.openxmlformats.org/officeDocument/2006/relationships" xmlns:w="http://schemas.openxmlformats.org/wordprocessingml/2006/main" xmlns:w14="http://schemas.microsoft.com/office/word/2010/wordml" xmlns:w15="http://schemas.microsoft.com/office/word/2012/wordml" xmlns:w16cex="http://schemas.microsoft.com/office/word/2018/wordml/cex" xmlns:w16cid="http://schemas.microsoft.com/office/word/2016/wordml/cid" xmlns:w16="http://schemas.microsoft.com/office/word/2018/wordml" xmlns:w16sdtdh="http://schemas.microsoft.com/office/word/2020/wordml/sdtdatahash" xmlns:w16se="http://schemas.microsoft.com/office/word/2015/wordml/symex" mc:Ignorable="w14 w15 w16se w16cid w16 w16cex w16sdtdh">
+<w:webSettings xmlns:mc="http://schemas.openxmlformats.org/markup-compatibility/2006" xmlns:r="http://schemas.openxmlformats.org/officeDocument/2006/relationships" xmlns:w="http://schemas.openxmlformats.org/wordprocessingml/2006/main" xmlns:w14="http://schemas.microsoft.com/office/word/2010/wordml" xmlns:w15="http://schemas.microsoft.com/office/word/2012/wordml" xmlns:w16cid="http://schemas.microsoft.com/office/word/2016/wordml/cid" xmlns:w16se="http://schemas.microsoft.com/office/word/2015/wordml/symex" mc:Ignorable="w14 w15 w16se w16cid">
   <w:optimizeForBrowser/>
   <w:allowPNG/>
 </w:webSettings>

</xml_diff>